<commit_message>
Final pass on Chapter 7: The Valley That Steps Into the Light
</commit_message>
<xml_diff>
--- a/7 - The Valley That Steps Into the Light.docx
+++ b/7 - The Valley That Steps Into the Light.docx
@@ -5,7 +5,7 @@
   <w:body>
     <w:p>
       <w:pPr>
-        <w:pStyle w:val="Heading1"/>
+        <w:pStyle w:val="Heading2"/>
       </w:pPr>
       <w:bookmarkStart w:id="0" w:name="_TOC_250004"/>
       <w:bookmarkStart w:id="1" w:name="_Toc234028656"/>
@@ -47,10 +47,17 @@
           <w:i/>
           <w:iCs/>
         </w:rPr>
-        <w:t>thank God</w:t>
-      </w:r>
-      <w:r>
-        <w:t>, Davey thinks. Frank forces a smile that looks only slightly less strained than a man trying to pass a kidney stone as they both stand and head towards the house.</w:t>
+        <w:t>T</w:t>
+      </w:r>
+      <w:r>
+        <w:rPr>
+          <w:i/>
+          <w:iCs/>
+        </w:rPr>
+        <w:t xml:space="preserve">hank God, </w:t>
+      </w:r>
+      <w:r>
+        <w:t>Davey thinks. Frank forces a smile that looks only slightly less strained than a man trying to pass a kidney stone as they both stand and head towards the house.</w:t>
       </w:r>
     </w:p>
     <w:p>
@@ -336,6 +343,13 @@
         <w:t xml:space="preserve"> is sorry</w:t>
       </w:r>
       <w:r>
+        <w:rPr>
+          <w:i/>
+          <w:iCs/>
+        </w:rPr>
+        <w:t>,</w:t>
+      </w:r>
+      <w:r>
         <w:t xml:space="preserve"> while Frank laughs. “That’s better than a punch to the arm. And absolutely teaches you for trying to turn this story into Oz.”</w:t>
       </w:r>
     </w:p>
@@ -373,7 +387,14 @@
           <w:i/>
           <w:iCs/>
         </w:rPr>
-        <w:t>why am I always chasing after dogs lately</w:t>
+        <w:t>W</w:t>
+      </w:r>
+      <w:r>
+        <w:rPr>
+          <w:i/>
+          <w:iCs/>
+        </w:rPr>
+        <w:t>hy am I always chasing after dogs lately</w:t>
       </w:r>
       <w:r>
         <w:rPr>
@@ -403,17 +424,10 @@
           <w:i/>
           <w:iCs/>
         </w:rPr>
-        <w:t>Y</w:t>
-      </w:r>
-      <w:r>
-        <w:rPr>
-          <w:i/>
-          <w:iCs/>
-        </w:rPr>
-        <w:t>ou naughty girl, Kaya</w:t>
-      </w:r>
-      <w:r>
-        <w:t xml:space="preserve">. Kaya gives one more bark in an effort to say, </w:t>
+        <w:t>You naughty girl, Kaya.</w:t>
+      </w:r>
+      <w:r>
+        <w:t xml:space="preserve"> Kaya gives one more bark in an effort to say, </w:t>
       </w:r>
       <w:r>
         <w:rPr>
@@ -483,31 +497,10 @@
           <w:i/>
           <w:iCs/>
         </w:rPr>
-        <w:t xml:space="preserve">I never asked </w:t>
-      </w:r>
-      <w:r>
-        <w:rPr>
-          <w:i/>
-          <w:iCs/>
-        </w:rPr>
-        <w:t>their</w:t>
-      </w:r>
-      <w:r>
-        <w:rPr>
-          <w:i/>
-          <w:iCs/>
-        </w:rPr>
-        <w:t xml:space="preserve"> name</w:t>
-      </w:r>
-      <w:r>
-        <w:rPr>
-          <w:i/>
-          <w:iCs/>
-        </w:rPr>
-        <w:t>s</w:t>
-      </w:r>
-      <w:r>
-        <w:t>. She was already fighting the butterflies about the dinner with Frank, but seeing the youngest of the brothers next to him was a shock she was not prepared for. Like many who wander into her valley, she did not expect to encounter the brothers again.</w:t>
+        <w:t>I never asked their names.</w:t>
+      </w:r>
+      <w:r>
+        <w:t xml:space="preserve"> She was already fighting the butterflies about the dinner with Frank, but seeing the youngest of the brothers next to him was a shock she was not prepared for. Like many who wander into her valley, she did not expect to encounter the brothers again.</w:t>
       </w:r>
     </w:p>
     <w:p>
@@ -526,17 +519,10 @@
           <w:i/>
           <w:iCs/>
         </w:rPr>
-        <w:t>B</w:t>
-      </w:r>
-      <w:r>
-        <w:rPr>
-          <w:i/>
-          <w:iCs/>
-        </w:rPr>
-        <w:t>oy, you need a comb</w:t>
-      </w:r>
-      <w:r>
-        <w:t xml:space="preserve">. His blue eyes are deeper than hers and reflect just how small Davey is feeling in the moment. Davey is a good six inches shorter than Frank, who is close in height to Jack. Even with his stocky build and Kaya poised in front of him, her ears extend just above his belt. Lea sees the contrast and is surprised just how big Kaya really is. Kaya and Davey, almost at the same instant, let a smirk form on their lips and a flush colors her body as the horror sets in. </w:t>
+        <w:t>Boy, you need a comb.</w:t>
+      </w:r>
+      <w:r>
+        <w:t xml:space="preserve"> His blue eyes are deeper than hers and reflect just how small Davey is feeling in the moment. Davey is a good six inches shorter than Frank, who is close in height to Jack. Even with his stocky build and Kaya poised in front of him, her ears extend just above his belt. Lea sees the contrast and is surprised just how big Kaya really is. Kaya and Davey, almost at the same instant, let a smirk form on their lips and a flush colors her body as the horror sets in. </w:t>
       </w:r>
       <w:r>
         <w:rPr>
@@ -692,10 +678,10 @@
           <w:i/>
           <w:iCs/>
         </w:rPr>
-        <w:t>what’s up with him</w:t>
-      </w:r>
-      <w:r>
-        <w:t>. Lea mouths, “Later.”</w:t>
+        <w:t>what’s up with him.</w:t>
+      </w:r>
+      <w:r>
+        <w:t xml:space="preserve"> Lea mouths, “Later.”</w:t>
       </w:r>
     </w:p>
     <w:p>
@@ -780,38 +766,10 @@
           <w:i/>
           <w:iCs/>
         </w:rPr>
-        <w:t>T</w:t>
-      </w:r>
-      <w:r>
-        <w:rPr>
-          <w:i/>
-          <w:iCs/>
-        </w:rPr>
-        <w:t xml:space="preserve">hey do make an attractive pair of men you might find on the latest Harlequin </w:t>
-      </w:r>
-      <w:r>
-        <w:rPr>
-          <w:i/>
-          <w:iCs/>
-        </w:rPr>
-        <w:t>n</w:t>
-      </w:r>
-      <w:r>
-        <w:rPr>
-          <w:i/>
-          <w:iCs/>
-        </w:rPr>
-        <w:t>o</w:t>
-      </w:r>
-      <w:r>
-        <w:rPr>
-          <w:i/>
-          <w:iCs/>
-        </w:rPr>
-        <w:t>vel</w:t>
-      </w:r>
-      <w:r>
-        <w:t>, but it’s the one that now has entered into the light that she focuses on. What strikes her at first is that her husband is short. Not just normal for an adult male, but dwarfed by the two men he is standing between.  He squats down to meet the sea of kids and dogs on their level, but the only thing betraying him as the adult is the scruffy beard he won’t shave. As the four try to sort the kids and dogs to make introductions, Lisa sees Lea for the first time. She also dwarfs Davey.</w:t>
+        <w:t>They do make an attractive pair of men you might find on the latest Harlequin novel,</w:t>
+      </w:r>
+      <w:r>
+        <w:t xml:space="preserve"> but it’s the one that now has entered into the light that she focuses on. What strikes her at first is that her husband is short. Not just normal for an adult male, but dwarfed by the two men he is standing between.  He squats down to meet the sea of kids and dogs on their level, but the only thing betraying him as the adult is the scruffy beard he won’t shave. As the four try to sort the kids and dogs to make introductions, Lisa sees Lea for the first time. She also dwarfs Davey.</w:t>
       </w:r>
     </w:p>
     <w:p>
@@ -876,6 +834,7 @@
         <w:t>Lynn checks her reflection once more in the windowpane before heading out the door to stand on the back porch. It’s not the first time she’s wished for one of those old triangle dinner bells you saw in westerns. She tries to call out, but the rumpus is too loud as the kids fire questions over each other at the siblings.</w:t>
       </w:r>
     </w:p>
+    <w:p/>
     <w:sectPr>
       <w:pgSz w:w="12240" w:h="15840"/>
       <w:pgMar w:top="1440" w:right="1440" w:bottom="1440" w:left="1440" w:header="720" w:footer="720" w:gutter="0"/>
@@ -1427,7 +1386,7 @@
   <w:style w:type="paragraph" w:default="1" w:styleId="Normal">
     <w:name w:val="Normal"/>
     <w:qFormat/>
-    <w:rsid w:val="0087767C"/>
+    <w:rsid w:val="00354A91"/>
     <w:pPr>
       <w:keepNext/>
       <w:keepLines/>
@@ -1461,19 +1420,19 @@
     <w:basedOn w:val="Normal"/>
     <w:next w:val="Normal"/>
     <w:link w:val="Heading2Char"/>
+    <w:autoRedefine/>
     <w:uiPriority w:val="9"/>
-    <w:semiHidden/>
     <w:unhideWhenUsed/>
     <w:qFormat/>
-    <w:rsid w:val="0051428B"/>
+    <w:rsid w:val="00354A91"/>
     <w:pPr>
-      <w:spacing w:before="160" w:after="80"/>
+      <w:spacing w:after="240"/>
+      <w:jc w:val="center"/>
       <w:outlineLvl w:val="1"/>
     </w:pPr>
     <w:rPr>
       <w:rFonts w:eastAsiaTheme="majorEastAsia" w:cstheme="majorBidi"/>
-      <w:color w:val="365F91" w:themeColor="accent1" w:themeShade="BF"/>
-      <w:sz w:val="32"/>
+      <w:sz w:val="56"/>
       <w:szCs w:val="32"/>
     </w:rPr>
   </w:style>
@@ -1650,12 +1609,10 @@
     <w:basedOn w:val="DefaultParagraphFont"/>
     <w:link w:val="Heading2"/>
     <w:uiPriority w:val="9"/>
-    <w:semiHidden/>
-    <w:rsid w:val="0051428B"/>
+    <w:rsid w:val="00354A91"/>
     <w:rPr>
       <w:rFonts w:ascii="Times New Roman" w:eastAsiaTheme="majorEastAsia" w:hAnsi="Times New Roman" w:cstheme="majorBidi"/>
-      <w:color w:val="365F91" w:themeColor="accent1" w:themeShade="BF"/>
-      <w:sz w:val="32"/>
+      <w:sz w:val="56"/>
       <w:szCs w:val="32"/>
     </w:rPr>
   </w:style>

</xml_diff>